<commit_message>
3 kolone + 9pt font za veći kapacitet po stranici
https://claude.ai/code/session_017JvMZHvCbCck4PdkCA67A3
</commit_message>
<xml_diff>
--- a/Misa_Krizma.docx
+++ b/Misa_Krizma.docx
@@ -12,7 +12,7 @@
           <w:b w:val="0"/>
           <w:i w:val="0"/>
           <w:color w:val="000000"/>
-          <w:sz w:val="20"/>
+          <w:sz w:val="18"/>
         </w:rPr>
         <w:t>maranatha, dođi gospode</w:t>
       </w:r>
@@ -27,7 +27,7 @@
           <w:b w:val="0"/>
           <w:i w:val="0"/>
           <w:color w:val="000000"/>
-          <w:sz w:val="20"/>
+          <w:sz w:val="18"/>
         </w:rPr>
         <w:t>Duše sveti Dobrodošao, Duše sveti dobrodošao</w:t>
       </w:r>
@@ -43,7 +43,7 @@
           <w:b/>
           <w:i/>
           <w:color w:val="000000"/>
-          <w:sz w:val="20"/>
+          <w:sz w:val="18"/>
         </w:rPr>
         <w:t>U ovaj hram u ovaj dom, ovdje nek sve bude po tvom</w:t>
       </w:r>
@@ -59,7 +59,7 @@
           <w:b/>
           <w:i/>
           <w:color w:val="000000"/>
-          <w:sz w:val="20"/>
+          <w:sz w:val="18"/>
         </w:rPr>
         <w:t>Duše sveti dobrodošao ... 2x</w:t>
       </w:r>
@@ -74,7 +74,7 @@
           <w:b w:val="0"/>
           <w:i w:val="0"/>
           <w:color w:val="000000"/>
-          <w:sz w:val="20"/>
+          <w:sz w:val="18"/>
         </w:rPr>
         <w:t>Duše sveti mi te trebamo, duše sveti mi te trebamo</w:t>
       </w:r>
@@ -90,7 +90,7 @@
           <w:b/>
           <w:i/>
           <w:color w:val="000000"/>
-          <w:sz w:val="20"/>
+          <w:sz w:val="18"/>
         </w:rPr>
         <w:t>U ove dane godine za zadnju žetvu spremljene</w:t>
       </w:r>
@@ -106,7 +106,7 @@
           <w:b/>
           <w:i/>
           <w:color w:val="000000"/>
-          <w:sz w:val="20"/>
+          <w:sz w:val="18"/>
         </w:rPr>
         <w:t>Duše sveti mi te trebamo ... 2x</w:t>
       </w:r>
@@ -122,7 +122,7 @@
           <w:b/>
           <w:i/>
           <w:color w:val="000000"/>
-          <w:sz w:val="20"/>
+          <w:sz w:val="18"/>
         </w:rPr>
         <w:t>Duše sveti, duše sveti, duše sveti mi te trebamo...3x</w:t>
       </w:r>
@@ -137,7 +137,7 @@
           <w:b w:val="0"/>
           <w:i w:val="0"/>
           <w:color w:val="000000"/>
-          <w:sz w:val="20"/>
+          <w:sz w:val="18"/>
         </w:rPr>
         <w:t>____________________________________________________________</w:t>
       </w:r>
@@ -152,7 +152,7 @@
           <w:b w:val="0"/>
           <w:i w:val="0"/>
           <w:color w:val="000000"/>
-          <w:sz w:val="20"/>
+          <w:sz w:val="18"/>
         </w:rPr>
         <w:t>Gospodine, smiluj se Gospodine smiluj se</w:t>
       </w:r>
@@ -167,7 +167,7 @@
           <w:b w:val="0"/>
           <w:i w:val="0"/>
           <w:color w:val="000000"/>
-          <w:sz w:val="20"/>
+          <w:sz w:val="18"/>
         </w:rPr>
         <w:t>Gospodine, smiluj se Gospodine smiluj se</w:t>
       </w:r>
@@ -182,7 +182,7 @@
           <w:b w:val="0"/>
           <w:i w:val="0"/>
           <w:color w:val="000000"/>
-          <w:sz w:val="20"/>
+          <w:sz w:val="18"/>
         </w:rPr>
         <w:t>Chorus 1</w:t>
       </w:r>
@@ -197,7 +197,7 @@
           <w:b w:val="0"/>
           <w:i w:val="0"/>
           <w:color w:val="000000"/>
-          <w:sz w:val="20"/>
+          <w:sz w:val="18"/>
         </w:rPr>
         <w:t>Kriste, smiluj se Kriste smiluj se</w:t>
       </w:r>
@@ -212,7 +212,7 @@
           <w:b w:val="0"/>
           <w:i w:val="0"/>
           <w:color w:val="000000"/>
-          <w:sz w:val="20"/>
+          <w:sz w:val="18"/>
         </w:rPr>
         <w:t>Kriste, smiluj se Kriste smiluj se</w:t>
       </w:r>
@@ -227,7 +227,7 @@
           <w:b w:val="0"/>
           <w:i w:val="0"/>
           <w:color w:val="000000"/>
-          <w:sz w:val="20"/>
+          <w:sz w:val="18"/>
         </w:rPr>
         <w:t>Gospodine, smiluj se Gospodine smiluj se</w:t>
       </w:r>
@@ -242,7 +242,7 @@
           <w:b w:val="0"/>
           <w:i w:val="0"/>
           <w:color w:val="000000"/>
-          <w:sz w:val="20"/>
+          <w:sz w:val="18"/>
         </w:rPr>
         <w:t>Gospodine, smiluj se Gospodine smiluj se</w:t>
       </w:r>
@@ -257,7 +257,7 @@
           <w:b w:val="0"/>
           <w:i w:val="0"/>
           <w:color w:val="000000"/>
-          <w:sz w:val="20"/>
+          <w:sz w:val="18"/>
         </w:rPr>
         <w:t>____________________________________________________________</w:t>
       </w:r>
@@ -272,7 +272,7 @@
           <w:b w:val="0"/>
           <w:i w:val="0"/>
           <w:color w:val="000000"/>
-          <w:sz w:val="20"/>
+          <w:sz w:val="18"/>
         </w:rPr>
         <w:t>Slava Bogu na visini!</w:t>
       </w:r>
@@ -287,7 +287,7 @@
           <w:b w:val="0"/>
           <w:i w:val="0"/>
           <w:color w:val="000000"/>
-          <w:sz w:val="20"/>
+          <w:sz w:val="18"/>
         </w:rPr>
         <w:t>I na zemlji ljudima dobre volje mir</w:t>
       </w:r>
@@ -302,7 +302,7 @@
           <w:b w:val="0"/>
           <w:i w:val="0"/>
           <w:color w:val="000000"/>
-          <w:sz w:val="20"/>
+          <w:sz w:val="18"/>
         </w:rPr>
         <w:t>Hvalimo te, Blagoslivljamo Te,</w:t>
       </w:r>
@@ -317,7 +317,7 @@
           <w:b w:val="0"/>
           <w:i w:val="0"/>
           <w:color w:val="000000"/>
-          <w:sz w:val="20"/>
+          <w:sz w:val="18"/>
         </w:rPr>
         <w:t>klanjamo Ti se, slavimo te.</w:t>
       </w:r>
@@ -332,7 +332,7 @@
           <w:b w:val="0"/>
           <w:i w:val="0"/>
           <w:color w:val="000000"/>
-          <w:sz w:val="20"/>
+          <w:sz w:val="18"/>
         </w:rPr>
         <w:t>Zahvaljujemo Ti radi velike slave Tvoje.</w:t>
       </w:r>
@@ -347,7 +347,7 @@
           <w:b w:val="0"/>
           <w:i w:val="0"/>
           <w:color w:val="000000"/>
-          <w:sz w:val="20"/>
+          <w:sz w:val="18"/>
         </w:rPr>
         <w:t>Gospodine Bože, Kralju nebeski, Bože oče Svemogući.</w:t>
       </w:r>
@@ -362,7 +362,7 @@
           <w:b w:val="0"/>
           <w:i w:val="0"/>
           <w:color w:val="000000"/>
-          <w:sz w:val="20"/>
+          <w:sz w:val="18"/>
         </w:rPr>
         <w:t>Gospodine Sine jedinorođeni, Isuse Kriste,</w:t>
       </w:r>
@@ -377,7 +377,7 @@
           <w:b w:val="0"/>
           <w:i w:val="0"/>
           <w:color w:val="000000"/>
-          <w:sz w:val="20"/>
+          <w:sz w:val="18"/>
         </w:rPr>
         <w:t>Gospodine Bože, Jaganjče Božji, Sine Očev</w:t>
       </w:r>
@@ -392,7 +392,7 @@
           <w:b w:val="0"/>
           <w:i w:val="0"/>
           <w:color w:val="000000"/>
-          <w:sz w:val="20"/>
+          <w:sz w:val="18"/>
         </w:rPr>
         <w:t>Koji oduzimaš grijehe svijeta, smiluj nam se.</w:t>
       </w:r>
@@ -407,7 +407,7 @@
           <w:b w:val="0"/>
           <w:i w:val="0"/>
           <w:color w:val="000000"/>
-          <w:sz w:val="20"/>
+          <w:sz w:val="18"/>
         </w:rPr>
         <w:t>Koji oduzimaš grijehe svijeta, primi našu molitvu</w:t>
       </w:r>
@@ -422,7 +422,7 @@
           <w:b w:val="0"/>
           <w:i w:val="0"/>
           <w:color w:val="000000"/>
-          <w:sz w:val="20"/>
+          <w:sz w:val="18"/>
         </w:rPr>
         <w:t>Koji sjediš s desne Ocu, smiluj nam se.</w:t>
       </w:r>
@@ -437,7 +437,7 @@
           <w:b w:val="0"/>
           <w:i w:val="0"/>
           <w:color w:val="000000"/>
-          <w:sz w:val="20"/>
+          <w:sz w:val="18"/>
         </w:rPr>
         <w:t>Jer ti si jedini svet</w:t>
       </w:r>
@@ -452,7 +452,7 @@
           <w:b w:val="0"/>
           <w:i w:val="0"/>
           <w:color w:val="000000"/>
-          <w:sz w:val="20"/>
+          <w:sz w:val="18"/>
         </w:rPr>
         <w:t>Ti si jedini Gospodin</w:t>
       </w:r>
@@ -467,7 +467,7 @@
           <w:b w:val="0"/>
           <w:i w:val="0"/>
           <w:color w:val="000000"/>
-          <w:sz w:val="20"/>
+          <w:sz w:val="18"/>
         </w:rPr>
         <w:t>jedini svevišnji, Isuse Kriste</w:t>
       </w:r>
@@ -482,7 +482,7 @@
           <w:b w:val="0"/>
           <w:i w:val="0"/>
           <w:color w:val="000000"/>
-          <w:sz w:val="20"/>
+          <w:sz w:val="18"/>
         </w:rPr>
         <w:t>Sa svetim Duhom, u slavi Boga Oca.</w:t>
       </w:r>
@@ -497,7 +497,7 @@
           <w:b w:val="0"/>
           <w:i w:val="0"/>
           <w:color w:val="000000"/>
-          <w:sz w:val="20"/>
+          <w:sz w:val="18"/>
         </w:rPr>
         <w:t>Amen</w:t>
       </w:r>
@@ -512,7 +512,7 @@
           <w:b w:val="0"/>
           <w:i w:val="0"/>
           <w:color w:val="000000"/>
-          <w:sz w:val="20"/>
+          <w:sz w:val="18"/>
         </w:rPr>
         <w:t>____________________________________________________________</w:t>
       </w:r>
@@ -528,7 +528,7 @@
           <w:b/>
           <w:i/>
           <w:color w:val="000000"/>
-          <w:sz w:val="20"/>
+          <w:sz w:val="18"/>
         </w:rPr>
         <w:t>Ljubav je strpljiva</w:t>
       </w:r>
@@ -544,7 +544,7 @@
           <w:b/>
           <w:i/>
           <w:color w:val="000000"/>
-          <w:sz w:val="20"/>
+          <w:sz w:val="18"/>
         </w:rPr>
         <w:t>Ljubav je dobrostiva</w:t>
       </w:r>
@@ -560,7 +560,7 @@
           <w:b/>
           <w:i/>
           <w:color w:val="000000"/>
-          <w:sz w:val="20"/>
+          <w:sz w:val="18"/>
         </w:rPr>
         <w:t>Ona ne zavidi Ne hvasta se ne oholi</w:t>
       </w:r>
@@ -576,7 +576,7 @@
           <w:b/>
           <w:i/>
           <w:color w:val="000000"/>
-          <w:sz w:val="20"/>
+          <w:sz w:val="18"/>
         </w:rPr>
         <w:t>Nije nepristojna Svoje ne traži</w:t>
       </w:r>
@@ -592,7 +592,7 @@
           <w:b/>
           <w:i/>
           <w:color w:val="000000"/>
-          <w:sz w:val="20"/>
+          <w:sz w:val="18"/>
         </w:rPr>
         <w:t>Nije razdražljiva, oprašta, zla zaboravlja</w:t>
       </w:r>
@@ -608,7 +608,7 @@
           <w:b/>
           <w:i/>
           <w:color w:val="000000"/>
-          <w:sz w:val="20"/>
+          <w:sz w:val="18"/>
         </w:rPr>
         <w:t>Ljubav je strpljiva</w:t>
       </w:r>
@@ -624,7 +624,7 @@
           <w:b/>
           <w:i/>
           <w:color w:val="000000"/>
-          <w:sz w:val="20"/>
+          <w:sz w:val="18"/>
         </w:rPr>
         <w:t>Ljubav je dobrostiva</w:t>
       </w:r>
@@ -640,7 +640,7 @@
           <w:b/>
           <w:i/>
           <w:color w:val="000000"/>
-          <w:sz w:val="20"/>
+          <w:sz w:val="18"/>
         </w:rPr>
         <w:t>Ona ne zavidi Ne hvasta se ne oholi</w:t>
       </w:r>
@@ -656,7 +656,7 @@
           <w:b/>
           <w:i/>
           <w:color w:val="000000"/>
-          <w:sz w:val="20"/>
+          <w:sz w:val="18"/>
         </w:rPr>
         <w:t>Nije nepristojna Svoje ne traži</w:t>
       </w:r>
@@ -672,7 +672,7 @@
           <w:b/>
           <w:i/>
           <w:color w:val="000000"/>
-          <w:sz w:val="20"/>
+          <w:sz w:val="18"/>
         </w:rPr>
         <w:t>Nije razdražljiva, oprašta, zla zaboravlja</w:t>
       </w:r>
@@ -688,7 +688,7 @@
           <w:b/>
           <w:i/>
           <w:color w:val="000000"/>
-          <w:sz w:val="20"/>
+          <w:sz w:val="18"/>
         </w:rPr>
         <w:t>proroštva, ona će izčeznuti</w:t>
       </w:r>
@@ -704,7 +704,7 @@
           <w:b/>
           <w:i/>
           <w:color w:val="000000"/>
-          <w:sz w:val="20"/>
+          <w:sz w:val="18"/>
         </w:rPr>
         <w:t>jezici, jezici će umuknuti</w:t>
       </w:r>
@@ -720,7 +720,7 @@
           <w:b/>
           <w:i/>
           <w:color w:val="000000"/>
-          <w:sz w:val="20"/>
+          <w:sz w:val="18"/>
         </w:rPr>
         <w:t>znanja ona će nestati</w:t>
       </w:r>
@@ -736,7 +736,7 @@
           <w:b/>
           <w:i/>
           <w:color w:val="000000"/>
-          <w:sz w:val="20"/>
+          <w:sz w:val="18"/>
         </w:rPr>
         <w:t>Smao ljubav nikad nece prestati</w:t>
       </w:r>
@@ -751,7 +751,7 @@
           <w:b w:val="0"/>
           <w:i w:val="0"/>
           <w:color w:val="000000"/>
-          <w:sz w:val="20"/>
+          <w:sz w:val="18"/>
         </w:rPr>
         <w:t>____________________________________________________________</w:t>
       </w:r>
@@ -766,7 +766,7 @@
           <w:b w:val="0"/>
           <w:i w:val="0"/>
           <w:color w:val="000000"/>
-          <w:sz w:val="20"/>
+          <w:sz w:val="18"/>
         </w:rPr>
         <w:t>sa neba nas posjeti</w:t>
       </w:r>
@@ -781,7 +781,7 @@
           <w:b w:val="0"/>
           <w:i w:val="0"/>
           <w:color w:val="000000"/>
-          <w:sz w:val="20"/>
+          <w:sz w:val="18"/>
         </w:rPr>
         <w:t>zrakom svoje milosti.</w:t>
       </w:r>
@@ -796,7 +796,7 @@
           <w:b w:val="0"/>
           <w:i w:val="0"/>
           <w:color w:val="000000"/>
-          <w:sz w:val="20"/>
+          <w:sz w:val="18"/>
         </w:rPr>
         <w:t>Tješitelju tako blag,</w:t>
       </w:r>
@@ -811,7 +811,7 @@
           <w:b w:val="0"/>
           <w:i w:val="0"/>
           <w:color w:val="000000"/>
-          <w:sz w:val="20"/>
+          <w:sz w:val="18"/>
         </w:rPr>
         <w:t>ti nebeski goste drag,</w:t>
       </w:r>
@@ -826,7 +826,7 @@
           <w:b w:val="0"/>
           <w:i w:val="0"/>
           <w:color w:val="000000"/>
-          <w:sz w:val="20"/>
+          <w:sz w:val="18"/>
         </w:rPr>
         <w:t>pun miline, hlade tih.</w:t>
       </w:r>
@@ -841,7 +841,7 @@
           <w:b w:val="0"/>
           <w:i w:val="0"/>
           <w:color w:val="000000"/>
-          <w:sz w:val="20"/>
+          <w:sz w:val="18"/>
         </w:rPr>
         <w:t>Sjaju svjetla blaženog,</w:t>
       </w:r>
@@ -856,7 +856,7 @@
           <w:b w:val="0"/>
           <w:i w:val="0"/>
           <w:color w:val="000000"/>
-          <w:sz w:val="20"/>
+          <w:sz w:val="18"/>
         </w:rPr>
         <w:t>sjaj u srcu puka svog,</w:t>
       </w:r>
@@ -871,7 +871,7 @@
           <w:b w:val="0"/>
           <w:i w:val="0"/>
           <w:color w:val="000000"/>
-          <w:sz w:val="20"/>
+          <w:sz w:val="18"/>
         </w:rPr>
         <w:t>napuni nam dušu svu.</w:t>
       </w:r>
@@ -886,7 +886,7 @@
           <w:b w:val="0"/>
           <w:i w:val="0"/>
           <w:color w:val="000000"/>
-          <w:sz w:val="20"/>
+          <w:sz w:val="18"/>
         </w:rPr>
         <w:t>Mekšaj ćudi kamene,</w:t>
       </w:r>
@@ -901,7 +901,7 @@
           <w:b w:val="0"/>
           <w:i w:val="0"/>
           <w:color w:val="000000"/>
-          <w:sz w:val="20"/>
+          <w:sz w:val="18"/>
         </w:rPr>
         <w:t>zagrij grudi ledene,</w:t>
       </w:r>
@@ -916,7 +916,7 @@
           <w:b w:val="0"/>
           <w:i w:val="0"/>
           <w:color w:val="000000"/>
-          <w:sz w:val="20"/>
+          <w:sz w:val="18"/>
         </w:rPr>
         <w:t>ne daj nama putem zlim.</w:t>
       </w:r>
@@ -931,7 +931,7 @@
           <w:b w:val="0"/>
           <w:i w:val="0"/>
           <w:color w:val="000000"/>
-          <w:sz w:val="20"/>
+          <w:sz w:val="18"/>
         </w:rPr>
         <w:t>Daj nam krepost zaslužnu</w:t>
       </w:r>
@@ -946,7 +946,7 @@
           <w:b w:val="0"/>
           <w:i w:val="0"/>
           <w:color w:val="000000"/>
-          <w:sz w:val="20"/>
+          <w:sz w:val="18"/>
         </w:rPr>
         <w:t>i smrt lijepu, blaženu,</w:t>
       </w:r>
@@ -961,7 +961,7 @@
           <w:b w:val="0"/>
           <w:i w:val="0"/>
           <w:color w:val="000000"/>
-          <w:sz w:val="20"/>
+          <w:sz w:val="18"/>
         </w:rPr>
         <w:t>daj vjekovit svima raj.</w:t>
       </w:r>
@@ -976,7 +976,7 @@
           <w:b w:val="0"/>
           <w:i w:val="0"/>
           <w:color w:val="000000"/>
-          <w:sz w:val="20"/>
+          <w:sz w:val="18"/>
         </w:rPr>
         <w:t>amen aleluja</w:t>
       </w:r>
@@ -991,7 +991,7 @@
           <w:b w:val="0"/>
           <w:i w:val="0"/>
           <w:color w:val="000000"/>
-          <w:sz w:val="20"/>
+          <w:sz w:val="18"/>
         </w:rPr>
         <w:t>____________________________________________________________</w:t>
       </w:r>
@@ -1007,7 +1007,7 @@
           <w:b/>
           <w:i/>
           <w:color w:val="000000"/>
-          <w:sz w:val="20"/>
+          <w:sz w:val="18"/>
         </w:rPr>
         <w:t>ALELUJA ALELU ALELUJA</w:t>
       </w:r>
@@ -1023,7 +1023,7 @@
           <w:b/>
           <w:i/>
           <w:color w:val="000000"/>
-          <w:sz w:val="20"/>
+          <w:sz w:val="18"/>
         </w:rPr>
         <w:t>ALELUJA ALELUUUJA</w:t>
       </w:r>
@@ -1039,7 +1039,7 @@
           <w:b/>
           <w:i/>
           <w:color w:val="000000"/>
-          <w:sz w:val="20"/>
+          <w:sz w:val="18"/>
         </w:rPr>
         <w:t>ALELUJA ALELU ALELUJA</w:t>
       </w:r>
@@ -1055,7 +1055,7 @@
           <w:b/>
           <w:i/>
           <w:color w:val="000000"/>
-          <w:sz w:val="20"/>
+          <w:sz w:val="18"/>
         </w:rPr>
         <w:t>ALELUJA ALELUUUJA</w:t>
       </w:r>
@@ -1070,7 +1070,7 @@
           <w:b w:val="0"/>
           <w:i w:val="0"/>
           <w:color w:val="000000"/>
-          <w:sz w:val="20"/>
+          <w:sz w:val="18"/>
         </w:rPr>
         <w:t>TRAŽITE NAJPRIJE BOŽJE KRALJEVSTVO I PRAVDU NJEGOVU</w:t>
       </w:r>
@@ -1085,7 +1085,7 @@
           <w:b w:val="0"/>
           <w:i w:val="0"/>
           <w:color w:val="000000"/>
-          <w:sz w:val="20"/>
+          <w:sz w:val="18"/>
         </w:rPr>
         <w:t>I SVE DRUGO BIT ĆE VAM NADODANO</w:t>
       </w:r>
@@ -1100,7 +1100,7 @@
           <w:b w:val="0"/>
           <w:i w:val="0"/>
           <w:color w:val="000000"/>
-          <w:sz w:val="20"/>
+          <w:sz w:val="18"/>
         </w:rPr>
         <w:t>ALELUJA ALELUUUJA</w:t>
       </w:r>
@@ -1115,7 +1115,7 @@
           <w:b w:val="0"/>
           <w:i w:val="0"/>
           <w:color w:val="000000"/>
-          <w:sz w:val="20"/>
+          <w:sz w:val="18"/>
         </w:rPr>
         <w:t>____________________________________________________________</w:t>
       </w:r>
@@ -1131,7 +1131,7 @@
           <w:b/>
           <w:i/>
           <w:color w:val="000000"/>
-          <w:sz w:val="20"/>
+          <w:sz w:val="18"/>
         </w:rPr>
         <w:t>Sveto Tijelo i sveta Krv</w:t>
       </w:r>
@@ -1147,7 +1147,7 @@
           <w:b/>
           <w:i/>
           <w:color w:val="000000"/>
-          <w:sz w:val="20"/>
+          <w:sz w:val="18"/>
         </w:rPr>
         <w:t>za nas se predaje</w:t>
       </w:r>
@@ -1163,7 +1163,7 @@
           <w:b/>
           <w:i/>
           <w:color w:val="000000"/>
-          <w:sz w:val="20"/>
+          <w:sz w:val="18"/>
         </w:rPr>
         <w:t>snagom ljubavi,</w:t>
       </w:r>
@@ -1179,7 +1179,7 @@
           <w:b/>
           <w:i/>
           <w:color w:val="000000"/>
-          <w:sz w:val="20"/>
+          <w:sz w:val="18"/>
         </w:rPr>
         <w:t>naš grijeh</w:t>
       </w:r>
@@ -1195,7 +1195,7 @@
           <w:b/>
           <w:i/>
           <w:color w:val="000000"/>
-          <w:sz w:val="20"/>
+          <w:sz w:val="18"/>
         </w:rPr>
         <w:t>na križu otkupljen je.</w:t>
       </w:r>
@@ -1211,7 +1211,7 @@
           <w:b/>
           <w:i/>
           <w:color w:val="000000"/>
-          <w:sz w:val="20"/>
+          <w:sz w:val="18"/>
         </w:rPr>
         <w:t>Srce na oltar, predaj srce na oltar</w:t>
       </w:r>
@@ -1227,7 +1227,7 @@
           <w:b/>
           <w:i/>
           <w:color w:val="000000"/>
-          <w:sz w:val="20"/>
+          <w:sz w:val="18"/>
         </w:rPr>
         <w:t>srce na oltar predaj srce Onom koji ljubi savršeno</w:t>
       </w:r>
@@ -1243,7 +1243,7 @@
           <w:b/>
           <w:i/>
           <w:color w:val="000000"/>
-          <w:sz w:val="20"/>
+          <w:sz w:val="18"/>
         </w:rPr>
         <w:t>Sveto Tijelo i sveta Krv</w:t>
       </w:r>
@@ -1259,7 +1259,7 @@
           <w:b/>
           <w:i/>
           <w:color w:val="000000"/>
-          <w:sz w:val="20"/>
+          <w:sz w:val="18"/>
         </w:rPr>
         <w:t>za nas se predaje</w:t>
       </w:r>
@@ -1275,7 +1275,7 @@
           <w:b/>
           <w:i/>
           <w:color w:val="000000"/>
-          <w:sz w:val="20"/>
+          <w:sz w:val="18"/>
         </w:rPr>
         <w:t>snagom ljubavi,</w:t>
       </w:r>
@@ -1291,7 +1291,7 @@
           <w:b/>
           <w:i/>
           <w:color w:val="000000"/>
-          <w:sz w:val="20"/>
+          <w:sz w:val="18"/>
         </w:rPr>
         <w:t>naš grijeh</w:t>
       </w:r>
@@ -1307,7 +1307,7 @@
           <w:b/>
           <w:i/>
           <w:color w:val="000000"/>
-          <w:sz w:val="20"/>
+          <w:sz w:val="18"/>
         </w:rPr>
         <w:t>na križu otkupljen je.</w:t>
       </w:r>
@@ -1323,7 +1323,7 @@
           <w:b/>
           <w:i/>
           <w:color w:val="000000"/>
-          <w:sz w:val="20"/>
+          <w:sz w:val="18"/>
         </w:rPr>
         <w:t>Srce na oltar, predaj srce na oltar</w:t>
       </w:r>
@@ -1339,7 +1339,7 @@
           <w:b/>
           <w:i/>
           <w:color w:val="000000"/>
-          <w:sz w:val="20"/>
+          <w:sz w:val="18"/>
         </w:rPr>
         <w:t>srce na oltar predaj srce Onom koji ljubi savršeno</w:t>
       </w:r>
@@ -1355,7 +1355,7 @@
           <w:b/>
           <w:i/>
           <w:color w:val="000000"/>
-          <w:sz w:val="20"/>
+          <w:sz w:val="18"/>
         </w:rPr>
         <w:t>Sveto Tijelo i sveta Krv</w:t>
       </w:r>
@@ -1371,7 +1371,7 @@
           <w:b/>
           <w:i/>
           <w:color w:val="000000"/>
-          <w:sz w:val="20"/>
+          <w:sz w:val="18"/>
         </w:rPr>
         <w:t>za nas se predaje</w:t>
       </w:r>
@@ -1387,7 +1387,7 @@
           <w:b/>
           <w:i/>
           <w:color w:val="000000"/>
-          <w:sz w:val="20"/>
+          <w:sz w:val="18"/>
         </w:rPr>
         <w:t>snagom ljubavi,</w:t>
       </w:r>
@@ -1403,7 +1403,7 @@
           <w:b/>
           <w:i/>
           <w:color w:val="000000"/>
-          <w:sz w:val="20"/>
+          <w:sz w:val="18"/>
         </w:rPr>
         <w:t>naš grijeh</w:t>
       </w:r>
@@ -1419,7 +1419,7 @@
           <w:b/>
           <w:i/>
           <w:color w:val="000000"/>
-          <w:sz w:val="20"/>
+          <w:sz w:val="18"/>
         </w:rPr>
         <w:t>na križu otkupljen je.</w:t>
       </w:r>
@@ -1434,7 +1434,7 @@
           <w:b w:val="0"/>
           <w:i w:val="0"/>
           <w:color w:val="000000"/>
-          <w:sz w:val="20"/>
+          <w:sz w:val="18"/>
         </w:rPr>
         <w:t>____________________________________________________________</w:t>
       </w:r>
@@ -1449,7 +1449,7 @@
           <w:b w:val="0"/>
           <w:i w:val="0"/>
           <w:color w:val="000000"/>
-          <w:sz w:val="20"/>
+          <w:sz w:val="18"/>
         </w:rPr>
         <w:t>Svet svet svet gospodin Bog sabaot</w:t>
       </w:r>
@@ -1464,7 +1464,7 @@
           <w:b w:val="0"/>
           <w:i w:val="0"/>
           <w:color w:val="000000"/>
-          <w:sz w:val="20"/>
+          <w:sz w:val="18"/>
         </w:rPr>
         <w:t>puna su nebesa i zemlja Tvoje slave</w:t>
       </w:r>
@@ -1480,7 +1480,7 @@
           <w:b/>
           <w:i/>
           <w:color w:val="000000"/>
-          <w:sz w:val="20"/>
+          <w:sz w:val="18"/>
         </w:rPr>
         <w:t>Hosana, Hosana Hosana u visini</w:t>
       </w:r>
@@ -1495,7 +1495,7 @@
           <w:b w:val="0"/>
           <w:i w:val="0"/>
           <w:color w:val="000000"/>
-          <w:sz w:val="20"/>
+          <w:sz w:val="18"/>
         </w:rPr>
         <w:t>Blagoslovljen koji u ime Boga dolazi</w:t>
       </w:r>
@@ -1510,7 +1510,7 @@
           <w:b w:val="0"/>
           <w:i w:val="0"/>
           <w:color w:val="000000"/>
-          <w:sz w:val="20"/>
+          <w:sz w:val="18"/>
         </w:rPr>
         <w:t>____________________________________________________________</w:t>
       </w:r>
@@ -1525,7 +1525,7 @@
           <w:b w:val="0"/>
           <w:i w:val="0"/>
           <w:color w:val="000000"/>
-          <w:sz w:val="20"/>
+          <w:sz w:val="18"/>
         </w:rPr>
         <w:t>Jaganjče Božji koji oduzimaš grijehe svijeta</w:t>
       </w:r>
@@ -1540,7 +1540,7 @@
           <w:b w:val="0"/>
           <w:i w:val="0"/>
           <w:color w:val="000000"/>
-          <w:sz w:val="20"/>
+          <w:sz w:val="18"/>
         </w:rPr>
         <w:t>Chorus 1</w:t>
       </w:r>
@@ -1555,7 +1555,7 @@
           <w:b w:val="0"/>
           <w:i w:val="0"/>
           <w:color w:val="000000"/>
-          <w:sz w:val="20"/>
+          <w:sz w:val="18"/>
         </w:rPr>
         <w:t>Smiluj nam se, Smiluj nam se ...x2</w:t>
       </w:r>
@@ -1570,7 +1570,7 @@
           <w:b w:val="0"/>
           <w:i w:val="0"/>
           <w:color w:val="000000"/>
-          <w:sz w:val="20"/>
+          <w:sz w:val="18"/>
         </w:rPr>
         <w:t>Jagnjče Božji koji oduzimaš grijehe svijeta</w:t>
       </w:r>
@@ -1585,7 +1585,7 @@
           <w:b w:val="0"/>
           <w:i w:val="0"/>
           <w:color w:val="000000"/>
-          <w:sz w:val="20"/>
+          <w:sz w:val="18"/>
         </w:rPr>
         <w:t>Chorus 2</w:t>
       </w:r>
@@ -1600,7 +1600,7 @@
           <w:b w:val="0"/>
           <w:i w:val="0"/>
           <w:color w:val="000000"/>
-          <w:sz w:val="20"/>
+          <w:sz w:val="18"/>
         </w:rPr>
         <w:t>daruj nam mir, daruj nam mir</w:t>
       </w:r>
@@ -1615,7 +1615,7 @@
           <w:b w:val="0"/>
           <w:i w:val="0"/>
           <w:color w:val="000000"/>
-          <w:sz w:val="20"/>
+          <w:sz w:val="18"/>
         </w:rPr>
         <w:t>____________________________________________________________</w:t>
       </w:r>
@@ -1630,7 +1630,7 @@
           <w:b w:val="0"/>
           <w:i w:val="0"/>
           <w:color w:val="000000"/>
-          <w:sz w:val="20"/>
+          <w:sz w:val="18"/>
         </w:rPr>
         <w:t>Nebeski glas proslavlja Ga</w:t>
       </w:r>
@@ -1645,7 +1645,7 @@
           <w:b w:val="0"/>
           <w:i w:val="0"/>
           <w:color w:val="000000"/>
-          <w:sz w:val="20"/>
+          <w:sz w:val="18"/>
         </w:rPr>
         <w:t>I čitav svijet će slaviti! Bog čudesan je!</w:t>
       </w:r>
@@ -1660,7 +1660,7 @@
           <w:b w:val="0"/>
           <w:i w:val="0"/>
           <w:color w:val="000000"/>
-          <w:sz w:val="20"/>
+          <w:sz w:val="18"/>
         </w:rPr>
         <w:t>Sve stvoreno uzdiže glas</w:t>
       </w:r>
@@ -1675,7 +1675,7 @@
           <w:b w:val="0"/>
           <w:i w:val="0"/>
           <w:color w:val="000000"/>
-          <w:sz w:val="20"/>
+          <w:sz w:val="18"/>
         </w:rPr>
         <w:t>i pjeva Mu: blagoslovljen Kralj nad kraljevima!</w:t>
       </w:r>
@@ -1691,7 +1691,7 @@
           <w:b/>
           <w:i/>
           <w:color w:val="000000"/>
-          <w:sz w:val="20"/>
+          <w:sz w:val="18"/>
         </w:rPr>
         <w:t>Slavu Mu dajmo, slavu Mu dajmo,</w:t>
       </w:r>
@@ -1707,7 +1707,7 @@
           <w:b/>
           <w:i/>
           <w:color w:val="000000"/>
-          <w:sz w:val="20"/>
+          <w:sz w:val="18"/>
         </w:rPr>
         <w:t>Isus je Gospod Bog!</w:t>
       </w:r>
@@ -1723,7 +1723,7 @@
           <w:b/>
           <w:i/>
           <w:color w:val="000000"/>
-          <w:sz w:val="20"/>
+          <w:sz w:val="18"/>
         </w:rPr>
         <w:t>Slavu Mu dajmo, slavu Mu dajmo,</w:t>
       </w:r>
@@ -1739,7 +1739,7 @@
           <w:b/>
           <w:i/>
           <w:color w:val="000000"/>
-          <w:sz w:val="20"/>
+          <w:sz w:val="18"/>
         </w:rPr>
         <w:t>Isus je Gospod Bog!</w:t>
       </w:r>
@@ -1754,7 +1754,7 @@
           <w:b w:val="0"/>
           <w:i w:val="0"/>
           <w:color w:val="000000"/>
-          <w:sz w:val="20"/>
+          <w:sz w:val="18"/>
         </w:rPr>
         <w:t>Kralj vječnosti opet će doć',</w:t>
       </w:r>
@@ -1769,7 +1769,7 @@
           <w:b w:val="0"/>
           <w:i w:val="0"/>
           <w:color w:val="000000"/>
-          <w:sz w:val="20"/>
+          <w:sz w:val="18"/>
         </w:rPr>
         <w:t>Iako zemlja nestat će, znaj, vječna je Riječ!</w:t>
       </w:r>
@@ -1785,7 +1785,7 @@
           <w:b/>
           <w:i/>
           <w:color w:val="000000"/>
-          <w:sz w:val="20"/>
+          <w:sz w:val="18"/>
         </w:rPr>
         <w:t>Slavu Mu dajmo, slavu Mu dajmo,</w:t>
       </w:r>
@@ -1801,7 +1801,7 @@
           <w:b/>
           <w:i/>
           <w:color w:val="000000"/>
-          <w:sz w:val="20"/>
+          <w:sz w:val="18"/>
         </w:rPr>
         <w:t>Isus je Gospod Bog!</w:t>
       </w:r>
@@ -1817,7 +1817,7 @@
           <w:b/>
           <w:i/>
           <w:color w:val="000000"/>
-          <w:sz w:val="20"/>
+          <w:sz w:val="18"/>
         </w:rPr>
         <w:t>Njemu se divi, Njemu se klanjaj,</w:t>
       </w:r>
@@ -1833,7 +1833,7 @@
           <w:b/>
           <w:i/>
           <w:color w:val="000000"/>
-          <w:sz w:val="20"/>
+          <w:sz w:val="18"/>
         </w:rPr>
         <w:t>Isus je Gospod Bog!</w:t>
       </w:r>
@@ -1849,7 +1849,7 @@
           <w:b/>
           <w:i/>
           <w:color w:val="000000"/>
-          <w:sz w:val="20"/>
+          <w:sz w:val="18"/>
         </w:rPr>
         <w:t>Aleluja, aleluja!</w:t>
       </w:r>
@@ -1865,7 +1865,7 @@
           <w:b/>
           <w:i/>
           <w:color w:val="000000"/>
-          <w:sz w:val="20"/>
+          <w:sz w:val="18"/>
         </w:rPr>
         <w:t>Tebi slava pripada!</w:t>
       </w:r>
@@ -1881,7 +1881,7 @@
           <w:b/>
           <w:i/>
           <w:color w:val="000000"/>
-          <w:sz w:val="20"/>
+          <w:sz w:val="18"/>
         </w:rPr>
         <w:t>Slavu Mu dajmo, slavu Mu dajmo,</w:t>
       </w:r>
@@ -1897,7 +1897,7 @@
           <w:b/>
           <w:i/>
           <w:color w:val="000000"/>
-          <w:sz w:val="20"/>
+          <w:sz w:val="18"/>
         </w:rPr>
         <w:t>Isus je Gospod Bog!</w:t>
       </w:r>
@@ -1913,7 +1913,7 @@
           <w:b/>
           <w:i/>
           <w:color w:val="000000"/>
-          <w:sz w:val="20"/>
+          <w:sz w:val="18"/>
         </w:rPr>
         <w:t>Njemu se divi, Njemu se klanjaj,</w:t>
       </w:r>
@@ -1929,7 +1929,7 @@
           <w:b/>
           <w:i/>
           <w:color w:val="000000"/>
-          <w:sz w:val="20"/>
+          <w:sz w:val="18"/>
         </w:rPr>
         <w:t>Isus je Gospod Bog! x2</w:t>
       </w:r>
@@ -1945,7 +1945,7 @@
           <w:b/>
           <w:i/>
           <w:color w:val="000000"/>
-          <w:sz w:val="20"/>
+          <w:sz w:val="18"/>
         </w:rPr>
         <w:t>Isus je Gospod Bog!</w:t>
       </w:r>
@@ -1961,7 +1961,7 @@
           <w:b/>
           <w:i/>
           <w:color w:val="000000"/>
-          <w:sz w:val="20"/>
+          <w:sz w:val="18"/>
         </w:rPr>
         <w:t>Isus je Gospod Bog!</w:t>
       </w:r>
@@ -1976,7 +1976,7 @@
           <w:b w:val="0"/>
           <w:i w:val="0"/>
           <w:color w:val="000000"/>
-          <w:sz w:val="20"/>
+          <w:sz w:val="18"/>
         </w:rPr>
         <w:t>____________________________________________________________</w:t>
       </w:r>
@@ -1991,7 +1991,7 @@
           <w:b w:val="0"/>
           <w:i w:val="0"/>
           <w:color w:val="000000"/>
-          <w:sz w:val="20"/>
+          <w:sz w:val="18"/>
         </w:rPr>
         <w:t>Duh je Sveti na nama jer On nas pomaza</w:t>
       </w:r>
@@ -2006,7 +2006,7 @@
           <w:b w:val="0"/>
           <w:i w:val="0"/>
           <w:color w:val="000000"/>
-          <w:sz w:val="20"/>
+          <w:sz w:val="18"/>
         </w:rPr>
         <w:t>da siromašnima donesemo Radosnu vijest...2x</w:t>
       </w:r>
@@ -2021,7 +2021,7 @@
           <w:b w:val="0"/>
           <w:i w:val="0"/>
           <w:color w:val="000000"/>
-          <w:sz w:val="20"/>
+          <w:sz w:val="18"/>
         </w:rPr>
         <w:t>Oslobodit ćeš nas grijeha ovo je dan,</w:t>
       </w:r>
@@ -2036,7 +2036,7 @@
           <w:b w:val="0"/>
           <w:i w:val="0"/>
           <w:color w:val="000000"/>
-          <w:sz w:val="20"/>
+          <w:sz w:val="18"/>
         </w:rPr>
         <w:t>da naše rane poviješ,ovo je dan,</w:t>
       </w:r>
@@ -2051,7 +2051,7 @@
           <w:b w:val="0"/>
           <w:i w:val="0"/>
           <w:color w:val="000000"/>
-          <w:sz w:val="20"/>
+          <w:sz w:val="18"/>
         </w:rPr>
         <w:t>da podigneš sve slomljene,Ovo je dan,</w:t>
       </w:r>
@@ -2066,7 +2066,7 @@
           <w:b w:val="0"/>
           <w:i w:val="0"/>
           <w:color w:val="000000"/>
-          <w:sz w:val="20"/>
+          <w:sz w:val="18"/>
         </w:rPr>
         <w:t>Slavimo Te Bože naš!</w:t>
       </w:r>
@@ -2082,7 +2082,7 @@
           <w:b/>
           <w:i/>
           <w:color w:val="000000"/>
-          <w:sz w:val="20"/>
+          <w:sz w:val="18"/>
         </w:rPr>
         <w:t>Ovo je godina Tvoje velike milosti,</w:t>
       </w:r>
@@ -2098,7 +2098,7 @@
           <w:b/>
           <w:i/>
           <w:color w:val="000000"/>
-          <w:sz w:val="20"/>
+          <w:sz w:val="18"/>
         </w:rPr>
         <w:t>Ovo je dan Božje ljubavi za nas!</w:t>
       </w:r>
@@ -2113,7 +2113,7 @@
           <w:b w:val="0"/>
           <w:i w:val="0"/>
           <w:color w:val="000000"/>
-          <w:sz w:val="20"/>
+          <w:sz w:val="18"/>
         </w:rPr>
         <w:t>Duh je Sveti na nama jer On nas pomaza</w:t>
       </w:r>
@@ -2128,7 +2128,7 @@
           <w:b w:val="0"/>
           <w:i w:val="0"/>
           <w:color w:val="000000"/>
-          <w:sz w:val="20"/>
+          <w:sz w:val="18"/>
         </w:rPr>
         <w:t>da siromašnima donesemo Radosnu vijest...2x</w:t>
       </w:r>
@@ -2143,7 +2143,7 @@
           <w:b w:val="0"/>
           <w:i w:val="0"/>
           <w:color w:val="000000"/>
-          <w:sz w:val="20"/>
+          <w:sz w:val="18"/>
         </w:rPr>
         <w:t>Vjeronost Tvoja i dobrota su svaki dan</w:t>
       </w:r>
@@ -2158,7 +2158,7 @@
           <w:b w:val="0"/>
           <w:i w:val="0"/>
           <w:color w:val="000000"/>
-          <w:sz w:val="20"/>
+          <w:sz w:val="18"/>
         </w:rPr>
         <w:t>utjeha za dušu moju i za to ja</w:t>
       </w:r>
@@ -2173,7 +2173,7 @@
           <w:b w:val="0"/>
           <w:i w:val="0"/>
           <w:color w:val="000000"/>
-          <w:sz w:val="20"/>
+          <w:sz w:val="18"/>
         </w:rPr>
         <w:t>pjevam Tebi hvalospjeve i radujem se kad</w:t>
       </w:r>
@@ -2188,7 +2188,7 @@
           <w:b w:val="0"/>
           <w:i w:val="0"/>
           <w:color w:val="000000"/>
-          <w:sz w:val="20"/>
+          <w:sz w:val="18"/>
         </w:rPr>
         <w:t>slavimo te Bože naš!</w:t>
       </w:r>
@@ -2203,7 +2203,7 @@
           <w:b w:val="0"/>
           <w:i w:val="0"/>
           <w:color w:val="000000"/>
-          <w:sz w:val="20"/>
+          <w:sz w:val="18"/>
         </w:rPr>
         <w:t>____________________________________________________________</w:t>
       </w:r>
@@ -2218,7 +2218,7 @@
           <w:b w:val="0"/>
           <w:i w:val="0"/>
           <w:color w:val="000000"/>
-          <w:sz w:val="20"/>
+          <w:sz w:val="18"/>
         </w:rPr>
         <w:t>Dođi, Duše svetosti,</w:t>
       </w:r>
@@ -2233,7 +2233,7 @@
           <w:b w:val="0"/>
           <w:i w:val="0"/>
           <w:color w:val="000000"/>
-          <w:sz w:val="20"/>
+          <w:sz w:val="18"/>
         </w:rPr>
         <w:t>Duše ognja, zapali nas!</w:t>
       </w:r>
@@ -2248,7 +2248,7 @@
           <w:b w:val="0"/>
           <w:i w:val="0"/>
           <w:color w:val="000000"/>
-          <w:sz w:val="20"/>
+          <w:sz w:val="18"/>
         </w:rPr>
         <w:t>Dođi, Duše znanja...</w:t>
       </w:r>
@@ -2263,7 +2263,7 @@
           <w:b w:val="0"/>
           <w:i w:val="0"/>
           <w:color w:val="000000"/>
-          <w:sz w:val="20"/>
+          <w:sz w:val="18"/>
         </w:rPr>
         <w:t>Dođi, Duše,razuma...</w:t>
       </w:r>
@@ -2278,7 +2278,7 @@
           <w:b w:val="0"/>
           <w:i w:val="0"/>
           <w:color w:val="000000"/>
-          <w:sz w:val="20"/>
+          <w:sz w:val="18"/>
         </w:rPr>
         <w:t>Dođi, Duše, savjeta...</w:t>
       </w:r>
@@ -2293,7 +2293,7 @@
           <w:b w:val="0"/>
           <w:i w:val="0"/>
           <w:color w:val="000000"/>
-          <w:sz w:val="20"/>
+          <w:sz w:val="18"/>
         </w:rPr>
         <w:t>Dođi, Duše, jakosti...</w:t>
       </w:r>
@@ -2308,7 +2308,7 @@
           <w:b w:val="0"/>
           <w:i w:val="0"/>
           <w:color w:val="000000"/>
-          <w:sz w:val="20"/>
+          <w:sz w:val="18"/>
         </w:rPr>
         <w:t>Dođi, Duše, mudrosti...</w:t>
       </w:r>
@@ -2323,7 +2323,7 @@
           <w:b w:val="0"/>
           <w:i w:val="0"/>
           <w:color w:val="000000"/>
-          <w:sz w:val="20"/>
+          <w:sz w:val="18"/>
         </w:rPr>
         <w:t>Dođi, Duše, pobožnosti...</w:t>
       </w:r>
@@ -2338,7 +2338,7 @@
           <w:b w:val="0"/>
           <w:i w:val="0"/>
           <w:color w:val="000000"/>
-          <w:sz w:val="20"/>
+          <w:sz w:val="18"/>
         </w:rPr>
         <w:t>Dođi, Duše, straha Božjeg..</w:t>
       </w:r>
@@ -2353,7 +2353,7 @@
           <w:b w:val="0"/>
           <w:i w:val="0"/>
           <w:color w:val="000000"/>
-          <w:sz w:val="20"/>
+          <w:sz w:val="18"/>
         </w:rPr>
         <w:t>____________________________________________________________</w:t>
       </w:r>
@@ -2368,7 +2368,7 @@
           <w:b w:val="0"/>
           <w:i w:val="0"/>
           <w:color w:val="000000"/>
-          <w:sz w:val="20"/>
+          <w:sz w:val="18"/>
         </w:rPr>
         <w:t>Duše Sveti, Duše Sveti dođi sa vatrom.</w:t>
       </w:r>
@@ -2383,7 +2383,7 @@
           <w:b w:val="0"/>
           <w:i w:val="0"/>
           <w:color w:val="000000"/>
-          <w:sz w:val="20"/>
+          <w:sz w:val="18"/>
         </w:rPr>
         <w:t>Duše Sveti, Duše Sveti dođi sa vatrom.</w:t>
       </w:r>
@@ -2398,7 +2398,7 @@
           <w:b w:val="0"/>
           <w:i w:val="0"/>
           <w:color w:val="000000"/>
-          <w:sz w:val="20"/>
+          <w:sz w:val="18"/>
         </w:rPr>
         <w:t>Duše Sveti dođi sa vatrom.</w:t>
       </w:r>
@@ -2413,7 +2413,7 @@
           <w:b w:val="0"/>
           <w:i w:val="0"/>
           <w:color w:val="000000"/>
-          <w:sz w:val="20"/>
+          <w:sz w:val="18"/>
         </w:rPr>
         <w:t>Duše Sveti dođi sa vatrom.</w:t>
       </w:r>
@@ -2429,7 +2429,7 @@
           <w:b/>
           <w:i/>
           <w:color w:val="000000"/>
-          <w:sz w:val="20"/>
+          <w:sz w:val="18"/>
         </w:rPr>
         <w:t>Dodi Duše Sveti, neka vatra siđe</w:t>
       </w:r>
@@ -2445,7 +2445,7 @@
           <w:b/>
           <w:i/>
           <w:color w:val="000000"/>
-          <w:sz w:val="20"/>
+          <w:sz w:val="18"/>
         </w:rPr>
         <w:t>Dodi Duše Sveti, neka vatra siđe</w:t>
       </w:r>
@@ -2461,7 +2461,7 @@
           <w:b/>
           <w:i/>
           <w:color w:val="000000"/>
-          <w:sz w:val="20"/>
+          <w:sz w:val="18"/>
         </w:rPr>
         <w:t>neka vatra siđe, neka vatra siđe</w:t>
       </w:r>
@@ -2477,7 +2477,7 @@
           <w:b/>
           <w:i/>
           <w:color w:val="000000"/>
-          <w:sz w:val="20"/>
+          <w:sz w:val="18"/>
         </w:rPr>
         <w:t>neka vatra siđe, neka vatra siđe</w:t>
       </w:r>
@@ -2492,7 +2492,7 @@
           <w:b w:val="0"/>
           <w:i w:val="0"/>
           <w:color w:val="000000"/>
-          <w:sz w:val="20"/>
+          <w:sz w:val="18"/>
         </w:rPr>
         <w:t>Duše Sveti, Duše Sveti očisti mi srce</w:t>
       </w:r>
@@ -2507,7 +2507,7 @@
           <w:b w:val="0"/>
           <w:i w:val="0"/>
           <w:color w:val="000000"/>
-          <w:sz w:val="20"/>
+          <w:sz w:val="18"/>
         </w:rPr>
         <w:t>Duše Sveti, Duše Sveti očisti mi srce.</w:t>
       </w:r>
@@ -2522,7 +2522,7 @@
           <w:b w:val="0"/>
           <w:i w:val="0"/>
           <w:color w:val="000000"/>
-          <w:sz w:val="20"/>
+          <w:sz w:val="18"/>
         </w:rPr>
         <w:t>Duše Sveti očisti mi srce..</w:t>
       </w:r>
@@ -2537,7 +2537,7 @@
           <w:b w:val="0"/>
           <w:i w:val="0"/>
           <w:color w:val="000000"/>
-          <w:sz w:val="20"/>
+          <w:sz w:val="18"/>
         </w:rPr>
         <w:t>Duše Sveti očisti mi srce.</w:t>
       </w:r>
@@ -2552,7 +2552,7 @@
           <w:b w:val="0"/>
           <w:i w:val="0"/>
           <w:color w:val="000000"/>
-          <w:sz w:val="20"/>
+          <w:sz w:val="18"/>
         </w:rPr>
         <w:t>____________________________________________________________</w:t>
       </w:r>
@@ -2567,7 +2567,7 @@
           <w:b w:val="0"/>
           <w:i w:val="0"/>
           <w:color w:val="000000"/>
-          <w:sz w:val="20"/>
+          <w:sz w:val="18"/>
         </w:rPr>
         <w:t>Samo je jedan gospodar oluja</w:t>
       </w:r>
@@ -2582,7 +2582,7 @@
           <w:b w:val="0"/>
           <w:i w:val="0"/>
           <w:color w:val="000000"/>
-          <w:sz w:val="20"/>
+          <w:sz w:val="18"/>
         </w:rPr>
         <w:t>Mora vladar, kralj svih vjekova</w:t>
       </w:r>
@@ -2597,7 +2597,7 @@
           <w:b w:val="0"/>
           <w:i w:val="0"/>
           <w:color w:val="000000"/>
-          <w:sz w:val="20"/>
+          <w:sz w:val="18"/>
         </w:rPr>
         <w:t>Tvorac ljepōta, prijatelj vjeran</w:t>
       </w:r>
@@ -2612,7 +2612,7 @@
           <w:b w:val="0"/>
           <w:i w:val="0"/>
           <w:color w:val="000000"/>
-          <w:sz w:val="20"/>
+          <w:sz w:val="18"/>
         </w:rPr>
         <w:t>Ime koje ozdravlja</w:t>
       </w:r>
@@ -2628,7 +2628,7 @@
           <w:b/>
           <w:i/>
           <w:color w:val="000000"/>
-          <w:sz w:val="20"/>
+          <w:sz w:val="18"/>
         </w:rPr>
         <w:t>Isus, Isus...2x</w:t>
       </w:r>
@@ -2643,7 +2643,7 @@
           <w:b w:val="0"/>
           <w:i w:val="0"/>
           <w:color w:val="000000"/>
-          <w:sz w:val="20"/>
+          <w:sz w:val="18"/>
         </w:rPr>
         <w:t>Na drvu križa do smrti se daješ</w:t>
       </w:r>
@@ -2658,7 +2658,7 @@
           <w:b w:val="0"/>
           <w:i w:val="0"/>
           <w:color w:val="000000"/>
-          <w:sz w:val="20"/>
+          <w:sz w:val="18"/>
         </w:rPr>
         <w:t>Svoje rane da Tvojim sakrijem,</w:t>
       </w:r>
@@ -2673,7 +2673,7 @@
           <w:b w:val="0"/>
           <w:i w:val="0"/>
           <w:color w:val="000000"/>
-          <w:sz w:val="20"/>
+          <w:sz w:val="18"/>
         </w:rPr>
         <w:t>Takni, izliječi sve moje boli,</w:t>
       </w:r>
@@ -2688,7 +2688,7 @@
           <w:b w:val="0"/>
           <w:i w:val="0"/>
           <w:color w:val="000000"/>
-          <w:sz w:val="20"/>
+          <w:sz w:val="18"/>
         </w:rPr>
         <w:t>Spas je u Imenu Tvome</w:t>
       </w:r>
@@ -2704,7 +2704,7 @@
           <w:b/>
           <w:i/>
           <w:color w:val="000000"/>
-          <w:sz w:val="20"/>
+          <w:sz w:val="18"/>
         </w:rPr>
         <w:t>Njegove rane - moj lijek,</w:t>
       </w:r>
@@ -2720,7 +2720,7 @@
           <w:b/>
           <w:i/>
           <w:color w:val="000000"/>
-          <w:sz w:val="20"/>
+          <w:sz w:val="18"/>
         </w:rPr>
         <w:t>Njegovo srce za moj grijeh,</w:t>
       </w:r>
@@ -2736,7 +2736,7 @@
           <w:b/>
           <w:i/>
           <w:color w:val="000000"/>
-          <w:sz w:val="20"/>
+          <w:sz w:val="18"/>
         </w:rPr>
         <w:t>kopljem proboden - da izlije</w:t>
       </w:r>
@@ -2752,7 +2752,7 @@
           <w:b/>
           <w:i/>
           <w:color w:val="000000"/>
-          <w:sz w:val="20"/>
+          <w:sz w:val="18"/>
         </w:rPr>
         <w:t>na nas rijeke vode žive,</w:t>
       </w:r>
@@ -2768,7 +2768,7 @@
           <w:b/>
           <w:i/>
           <w:color w:val="000000"/>
-          <w:sz w:val="20"/>
+          <w:sz w:val="18"/>
         </w:rPr>
         <w:t>Ljubav ima Ime</w:t>
       </w:r>
@@ -2783,7 +2783,7 @@
           <w:b w:val="0"/>
           <w:i w:val="0"/>
           <w:color w:val="000000"/>
-          <w:sz w:val="20"/>
+          <w:sz w:val="18"/>
         </w:rPr>
         <w:t>____________________________________________________________</w:t>
       </w:r>
@@ -2799,7 +2799,7 @@
           <w:b/>
           <w:i/>
           <w:color w:val="000000"/>
-          <w:sz w:val="20"/>
+          <w:sz w:val="18"/>
         </w:rPr>
         <w:t>Rijeke žive vode potecite neka duh se razlije</w:t>
       </w:r>
@@ -2815,7 +2815,7 @@
           <w:b/>
           <w:i/>
           <w:color w:val="000000"/>
-          <w:sz w:val="20"/>
+          <w:sz w:val="18"/>
         </w:rPr>
         <w:t>svakom žednom srcu donesite Božju ljubav zauvijek</w:t>
       </w:r>
@@ -2830,7 +2830,7 @@
           <w:b w:val="0"/>
           <w:i w:val="0"/>
           <w:color w:val="000000"/>
-          <w:sz w:val="20"/>
+          <w:sz w:val="18"/>
         </w:rPr>
         <w:t>Kriste, ja u tvoje oči gledam samo tvojoj rriječi vjerujem</w:t>
       </w:r>
@@ -2845,7 +2845,7 @@
           <w:b w:val="0"/>
           <w:i w:val="0"/>
           <w:color w:val="000000"/>
-          <w:sz w:val="20"/>
+          <w:sz w:val="18"/>
         </w:rPr>
         <w:t>Ti obećao si ako budem vjeran da ćeš izlit svoga duha</w:t>
       </w:r>
@@ -2860,7 +2860,7 @@
           <w:b w:val="0"/>
           <w:i w:val="0"/>
           <w:color w:val="000000"/>
-          <w:sz w:val="20"/>
+          <w:sz w:val="18"/>
         </w:rPr>
         <w:t>Ti izliječi našu dušu, duh i tijelo zbog tebe se srce raduje</w:t>
       </w:r>
@@ -2875,7 +2875,7 @@
           <w:b w:val="0"/>
           <w:i w:val="0"/>
           <w:color w:val="000000"/>
-          <w:sz w:val="20"/>
+          <w:sz w:val="18"/>
         </w:rPr>
         <w:t>naša biće bit će sretno, bit će cijelo duše sveti ispuni nas</w:t>
       </w:r>
@@ -2890,7 +2890,7 @@
           <w:b w:val="0"/>
           <w:i w:val="0"/>
           <w:color w:val="000000"/>
-          <w:sz w:val="20"/>
+          <w:sz w:val="18"/>
         </w:rPr>
         <w:t>____________________________________________________________</w:t>
       </w:r>
@@ -2905,7 +2905,7 @@
           <w:b w:val="0"/>
           <w:i w:val="0"/>
           <w:color w:val="000000"/>
-          <w:sz w:val="20"/>
+          <w:sz w:val="18"/>
         </w:rPr>
         <w:t>Žive vode tecite, moju bol odnesite</w:t>
       </w:r>
@@ -2920,7 +2920,7 @@
           <w:b w:val="0"/>
           <w:i w:val="0"/>
           <w:color w:val="000000"/>
-          <w:sz w:val="20"/>
+          <w:sz w:val="18"/>
         </w:rPr>
         <w:t>Svoje zdravlje darujte mome srcu ranjenom (2x)</w:t>
       </w:r>
@@ -2936,7 +2936,7 @@
           <w:b/>
           <w:i/>
           <w:color w:val="000000"/>
-          <w:sz w:val="20"/>
+          <w:sz w:val="18"/>
         </w:rPr>
         <w:t>Isuse, kako čudesan si</w:t>
       </w:r>
@@ -2952,7 +2952,7 @@
           <w:b/>
           <w:i/>
           <w:color w:val="000000"/>
-          <w:sz w:val="20"/>
+          <w:sz w:val="18"/>
         </w:rPr>
         <w:t>Tako si nježan, jednostavan i blag</w:t>
       </w:r>
@@ -2968,7 +2968,7 @@
           <w:b/>
           <w:i/>
           <w:color w:val="000000"/>
-          <w:sz w:val="20"/>
+          <w:sz w:val="18"/>
         </w:rPr>
         <w:t>Kao zvijezda jutarnja sjajiš mi ti</w:t>
       </w:r>
@@ -2984,7 +2984,7 @@
           <w:b/>
           <w:i/>
           <w:color w:val="000000"/>
-          <w:sz w:val="20"/>
+          <w:sz w:val="18"/>
         </w:rPr>
         <w:t>Isuse, kako čudesan si</w:t>
       </w:r>
@@ -2999,7 +2999,7 @@
           <w:b w:val="0"/>
           <w:i w:val="0"/>
           <w:color w:val="000000"/>
-          <w:sz w:val="20"/>
+          <w:sz w:val="18"/>
         </w:rPr>
         <w:t>Žive vode tecite, moju bol odnesite</w:t>
       </w:r>
@@ -3014,7 +3014,7 @@
           <w:b w:val="0"/>
           <w:i w:val="0"/>
           <w:color w:val="000000"/>
-          <w:sz w:val="20"/>
+          <w:sz w:val="18"/>
         </w:rPr>
         <w:t>Svoje zdravlje darujte mome srcu ranjenom (1x)</w:t>
       </w:r>
@@ -3030,7 +3030,7 @@
           <w:b/>
           <w:i/>
           <w:color w:val="000000"/>
-          <w:sz w:val="20"/>
+          <w:sz w:val="18"/>
         </w:rPr>
         <w:t>Isuse, kako čudesan si</w:t>
       </w:r>
@@ -3046,7 +3046,7 @@
           <w:b/>
           <w:i/>
           <w:color w:val="000000"/>
-          <w:sz w:val="20"/>
+          <w:sz w:val="18"/>
         </w:rPr>
         <w:t>Tako si nježan, jednostavan i blag</w:t>
       </w:r>
@@ -3062,7 +3062,7 @@
           <w:b/>
           <w:i/>
           <w:color w:val="000000"/>
-          <w:sz w:val="20"/>
+          <w:sz w:val="18"/>
         </w:rPr>
         <w:t>Kao zvijezda jutarnja sjajiš mi ti</w:t>
       </w:r>
@@ -3078,7 +3078,7 @@
           <w:b/>
           <w:i/>
           <w:color w:val="000000"/>
-          <w:sz w:val="20"/>
+          <w:sz w:val="18"/>
         </w:rPr>
         <w:t>Isuse, kako čudesan si</w:t>
       </w:r>
@@ -3094,7 +3094,7 @@
           <w:b/>
           <w:i/>
           <w:color w:val="000000"/>
-          <w:sz w:val="20"/>
+          <w:sz w:val="18"/>
         </w:rPr>
         <w:t>sviramo</w:t>
       </w:r>
@@ -3110,7 +3110,7 @@
           <w:b/>
           <w:i/>
           <w:color w:val="000000"/>
-          <w:sz w:val="20"/>
+          <w:sz w:val="18"/>
         </w:rPr>
         <w:t>Isuse, kako čudesan si</w:t>
       </w:r>
@@ -3126,7 +3126,7 @@
           <w:b/>
           <w:i/>
           <w:color w:val="000000"/>
-          <w:sz w:val="20"/>
+          <w:sz w:val="18"/>
         </w:rPr>
         <w:t>Tako si nježan, jednostavan i blag</w:t>
       </w:r>
@@ -3142,7 +3142,7 @@
           <w:b/>
           <w:i/>
           <w:color w:val="000000"/>
-          <w:sz w:val="20"/>
+          <w:sz w:val="18"/>
         </w:rPr>
         <w:t>Kao zvijezda jutarnja sjajiš mi ti</w:t>
       </w:r>
@@ -3158,7 +3158,7 @@
           <w:b/>
           <w:i/>
           <w:color w:val="000000"/>
-          <w:sz w:val="20"/>
+          <w:sz w:val="18"/>
         </w:rPr>
         <w:t>Isuse, kako čudesan si</w:t>
       </w:r>
@@ -3174,7 +3174,7 @@
           <w:b/>
           <w:i/>
           <w:color w:val="000000"/>
-          <w:sz w:val="20"/>
+          <w:sz w:val="18"/>
         </w:rPr>
         <w:t>Kao zvijezda jutarnja sjajiš mi ti</w:t>
       </w:r>
@@ -3190,7 +3190,7 @@
           <w:b/>
           <w:i/>
           <w:color w:val="000000"/>
-          <w:sz w:val="20"/>
+          <w:sz w:val="18"/>
         </w:rPr>
         <w:t>Isuse, kako čudesan si</w:t>
       </w:r>
@@ -3205,7 +3205,7 @@
           <w:b w:val="0"/>
           <w:i w:val="0"/>
           <w:color w:val="000000"/>
-          <w:sz w:val="20"/>
+          <w:sz w:val="18"/>
         </w:rPr>
         <w:t>____________________________________________________________</w:t>
       </w:r>
@@ -3221,7 +3221,7 @@
           <w:b/>
           <w:i/>
           <w:color w:val="000000"/>
-          <w:sz w:val="20"/>
+          <w:sz w:val="18"/>
         </w:rPr>
         <w:t>D A FIS h</w:t>
       </w:r>
@@ -3237,7 +3237,7 @@
           <w:b/>
           <w:i/>
           <w:color w:val="000000"/>
-          <w:sz w:val="20"/>
+          <w:sz w:val="18"/>
         </w:rPr>
         <w:t>Ti dao si nam čvrstu riječ</w:t>
       </w:r>
@@ -3253,7 +3253,7 @@
           <w:b/>
           <w:i/>
           <w:color w:val="000000"/>
-          <w:sz w:val="20"/>
+          <w:sz w:val="18"/>
         </w:rPr>
         <w:t>Daj nam svima Duha svog</w:t>
       </w:r>
@@ -3269,7 +3269,7 @@
           <w:b/>
           <w:i/>
           <w:color w:val="000000"/>
-          <w:sz w:val="20"/>
+          <w:sz w:val="18"/>
         </w:rPr>
         <w:t>D A FIS h</w:t>
       </w:r>
@@ -3285,7 +3285,7 @@
           <w:b/>
           <w:i/>
           <w:color w:val="000000"/>
-          <w:sz w:val="20"/>
+          <w:sz w:val="18"/>
         </w:rPr>
         <w:t>Ne napuštaj nas nikada</w:t>
       </w:r>
@@ -3301,7 +3301,7 @@
           <w:b/>
           <w:i/>
           <w:color w:val="000000"/>
-          <w:sz w:val="20"/>
+          <w:sz w:val="18"/>
         </w:rPr>
         <w:t>Daj nam svima Duha svog</w:t>
       </w:r>
@@ -3316,7 +3316,7 @@
           <w:b w:val="0"/>
           <w:i w:val="0"/>
           <w:color w:val="000000"/>
-          <w:sz w:val="20"/>
+          <w:sz w:val="18"/>
         </w:rPr>
         <w:t>S nama ostani do konca sviju vjekova</w:t>
       </w:r>
@@ -3331,7 +3331,7 @@
           <w:b w:val="0"/>
           <w:i w:val="0"/>
           <w:color w:val="000000"/>
-          <w:sz w:val="20"/>
+          <w:sz w:val="18"/>
         </w:rPr>
         <w:t>daj nam snage da ti vjerujemo dovijeka</w:t>
       </w:r>
@@ -3346,7 +3346,7 @@
           <w:b w:val="0"/>
           <w:i w:val="0"/>
           <w:color w:val="000000"/>
-          <w:sz w:val="20"/>
+          <w:sz w:val="18"/>
         </w:rPr>
         <w:t>Prijateljstvo svoje već nam sada daješ ti,</w:t>
       </w:r>
@@ -3361,7 +3361,7 @@
           <w:b w:val="0"/>
           <w:i w:val="0"/>
           <w:color w:val="000000"/>
-          <w:sz w:val="20"/>
+          <w:sz w:val="18"/>
         </w:rPr>
         <w:t>kao djeca tvoga oca već smo priznati</w:t>
       </w:r>
@@ -3376,7 +3376,7 @@
           <w:b w:val="0"/>
           <w:i w:val="0"/>
           <w:color w:val="000000"/>
-          <w:sz w:val="20"/>
+          <w:sz w:val="18"/>
         </w:rPr>
         <w:t>Prijateljstvo svoje već nam sada daješ Ti,</w:t>
       </w:r>
@@ -3391,7 +3391,7 @@
           <w:b w:val="0"/>
           <w:i w:val="0"/>
           <w:color w:val="000000"/>
-          <w:sz w:val="20"/>
+          <w:sz w:val="18"/>
         </w:rPr>
         <w:t>daj nam svima Duha svog!</w:t>
       </w:r>
@@ -3406,7 +3406,7 @@
           <w:b w:val="0"/>
           <w:i w:val="0"/>
           <w:color w:val="000000"/>
-          <w:sz w:val="20"/>
+          <w:sz w:val="18"/>
         </w:rPr>
         <w:t>Kao djeca Tvoga Oca već smo priznati,</w:t>
       </w:r>
@@ -3421,7 +3421,7 @@
           <w:b w:val="0"/>
           <w:i w:val="0"/>
           <w:color w:val="000000"/>
-          <w:sz w:val="20"/>
+          <w:sz w:val="18"/>
         </w:rPr>
         <w:t>daj nam svima Duha svog!</w:t>
       </w:r>
@@ -3436,7 +3436,7 @@
           <w:b w:val="0"/>
           <w:i w:val="0"/>
           <w:color w:val="000000"/>
-          <w:sz w:val="20"/>
+          <w:sz w:val="18"/>
         </w:rPr>
         <w:t>Ti dao si nam...</w:t>
       </w:r>
@@ -3451,7 +3451,7 @@
           <w:b w:val="0"/>
           <w:i w:val="0"/>
           <w:color w:val="000000"/>
-          <w:sz w:val="20"/>
+          <w:sz w:val="18"/>
         </w:rPr>
         <w:t>Svaki dan Ti želim reći: daj nam Duha svog</w:t>
       </w:r>
@@ -3466,7 +3466,7 @@
           <w:b w:val="0"/>
           <w:i w:val="0"/>
           <w:color w:val="000000"/>
-          <w:sz w:val="20"/>
+          <w:sz w:val="18"/>
         </w:rPr>
         <w:t>daj nam svima Duha svog!</w:t>
       </w:r>
@@ -3481,7 +3481,7 @@
           <w:b w:val="0"/>
           <w:i w:val="0"/>
           <w:color w:val="000000"/>
-          <w:sz w:val="20"/>
+          <w:sz w:val="18"/>
         </w:rPr>
         <w:t>Koji život daje i put Ocu kazuje,</w:t>
       </w:r>
@@ -3496,7 +3496,7 @@
           <w:b w:val="0"/>
           <w:i w:val="0"/>
           <w:color w:val="000000"/>
-          <w:sz w:val="20"/>
+          <w:sz w:val="18"/>
         </w:rPr>
         <w:t>daj nam svima Duha svog!</w:t>
       </w:r>
@@ -3506,7 +3506,7 @@
       <w:pgMar w:top="850" w:right="850" w:bottom="850" w:left="850" w:header="720" w:footer="720" w:gutter="0"/>
       <w:cols w:space="720"/>
       <w:docGrid w:linePitch="360"/>
-      <w:cols w:num="2" w:space="720" w:equalWidth="1"/>
+      <w:cols w:num="3" w:space="720" w:equalWidth="1"/>
     </w:sectPr>
   </w:body>
 </w:document>
@@ -3880,7 +3880,7 @@
     </w:pPr>
     <w:rPr>
       <w:rFonts w:ascii="Times New Roman" w:hAnsi="Times New Roman"/>
-      <w:sz w:val="20"/>
+      <w:sz w:val="18"/>
     </w:rPr>
   </w:style>
   <w:style w:type="paragraph" w:styleId="Header">

</xml_diff>

<commit_message>
Skrati divider da ne prelazi u drugi red u 3-kolonskom layoutu
https://claude.ai/code/session_017JvMZHvCbCck4PdkCA67A3
</commit_message>
<xml_diff>
--- a/Misa_Krizma.docx
+++ b/Misa_Krizma.docx
@@ -139,7 +139,7 @@
           <w:color w:val="000000"/>
           <w:sz w:val="18"/>
         </w:rPr>
-        <w:t>____________________________________________________________</w:t>
+        <w:t>___________________________________</w:t>
       </w:r>
     </w:p>
     <w:p>
@@ -259,7 +259,7 @@
           <w:color w:val="000000"/>
           <w:sz w:val="18"/>
         </w:rPr>
-        <w:t>____________________________________________________________</w:t>
+        <w:t>___________________________________</w:t>
       </w:r>
     </w:p>
     <w:p>
@@ -514,7 +514,7 @@
           <w:color w:val="000000"/>
           <w:sz w:val="18"/>
         </w:rPr>
-        <w:t>____________________________________________________________</w:t>
+        <w:t>___________________________________</w:t>
       </w:r>
     </w:p>
     <w:p>
@@ -753,7 +753,7 @@
           <w:color w:val="000000"/>
           <w:sz w:val="18"/>
         </w:rPr>
-        <w:t>____________________________________________________________</w:t>
+        <w:t>___________________________________</w:t>
       </w:r>
     </w:p>
     <w:p>
@@ -993,7 +993,7 @@
           <w:color w:val="000000"/>
           <w:sz w:val="18"/>
         </w:rPr>
-        <w:t>____________________________________________________________</w:t>
+        <w:t>___________________________________</w:t>
       </w:r>
     </w:p>
     <w:p>
@@ -1117,7 +1117,7 @@
           <w:color w:val="000000"/>
           <w:sz w:val="18"/>
         </w:rPr>
-        <w:t>____________________________________________________________</w:t>
+        <w:t>___________________________________</w:t>
       </w:r>
     </w:p>
     <w:p>
@@ -1436,7 +1436,7 @@
           <w:color w:val="000000"/>
           <w:sz w:val="18"/>
         </w:rPr>
-        <w:t>____________________________________________________________</w:t>
+        <w:t>___________________________________</w:t>
       </w:r>
     </w:p>
     <w:p>
@@ -1512,7 +1512,7 @@
           <w:color w:val="000000"/>
           <w:sz w:val="18"/>
         </w:rPr>
-        <w:t>____________________________________________________________</w:t>
+        <w:t>___________________________________</w:t>
       </w:r>
     </w:p>
     <w:p>
@@ -1617,7 +1617,7 @@
           <w:color w:val="000000"/>
           <w:sz w:val="18"/>
         </w:rPr>
-        <w:t>____________________________________________________________</w:t>
+        <w:t>___________________________________</w:t>
       </w:r>
     </w:p>
     <w:p>
@@ -1978,7 +1978,7 @@
           <w:color w:val="000000"/>
           <w:sz w:val="18"/>
         </w:rPr>
-        <w:t>____________________________________________________________</w:t>
+        <w:t>___________________________________</w:t>
       </w:r>
     </w:p>
     <w:p>
@@ -2205,7 +2205,7 @@
           <w:color w:val="000000"/>
           <w:sz w:val="18"/>
         </w:rPr>
-        <w:t>____________________________________________________________</w:t>
+        <w:t>___________________________________</w:t>
       </w:r>
     </w:p>
     <w:p>
@@ -2355,7 +2355,7 @@
           <w:color w:val="000000"/>
           <w:sz w:val="18"/>
         </w:rPr>
-        <w:t>____________________________________________________________</w:t>
+        <w:t>___________________________________</w:t>
       </w:r>
     </w:p>
     <w:p>
@@ -2554,7 +2554,7 @@
           <w:color w:val="000000"/>
           <w:sz w:val="18"/>
         </w:rPr>
-        <w:t>____________________________________________________________</w:t>
+        <w:t>___________________________________</w:t>
       </w:r>
     </w:p>
     <w:p>
@@ -2785,7 +2785,7 @@
           <w:color w:val="000000"/>
           <w:sz w:val="18"/>
         </w:rPr>
-        <w:t>____________________________________________________________</w:t>
+        <w:t>___________________________________</w:t>
       </w:r>
     </w:p>
     <w:p>
@@ -2892,7 +2892,7 @@
           <w:color w:val="000000"/>
           <w:sz w:val="18"/>
         </w:rPr>
-        <w:t>____________________________________________________________</w:t>
+        <w:t>___________________________________</w:t>
       </w:r>
     </w:p>
     <w:p>
@@ -3207,7 +3207,7 @@
           <w:color w:val="000000"/>
           <w:sz w:val="18"/>
         </w:rPr>
-        <w:t>____________________________________________________________</w:t>
+        <w:t>___________________________________</w:t>
       </w:r>
     </w:p>
     <w:p>

</xml_diff>

<commit_message>
Smanji margine na 0.5cm (minimalne) za PDF i Word
https://claude.ai/code/session_017JvMZHvCbCck4PdkCA67A3
</commit_message>
<xml_diff>
--- a/Misa_Krizma.docx
+++ b/Misa_Krizma.docx
@@ -175,27 +175,13 @@
     <w:p>
       <w:pPr>
         <w:spacing w:before="0" w:after="0"/>
+        <w:ind w:left="720"/>
       </w:pPr>
       <w:r>
         <w:rPr>
           <w:rFonts w:ascii="Times New Roman" w:hAnsi="Times New Roman"/>
-          <w:b w:val="0"/>
-          <w:i w:val="0"/>
-          <w:color w:val="000000"/>
-          <w:sz w:val="18"/>
-        </w:rPr>
-        <w:t>Chorus 1</w:t>
-      </w:r>
-    </w:p>
-    <w:p>
-      <w:pPr>
-        <w:spacing w:before="0" w:after="0"/>
-      </w:pPr>
-      <w:r>
-        <w:rPr>
-          <w:rFonts w:ascii="Times New Roman" w:hAnsi="Times New Roman"/>
-          <w:b w:val="0"/>
-          <w:i w:val="0"/>
+          <w:b/>
+          <w:i/>
           <w:color w:val="000000"/>
           <w:sz w:val="18"/>
         </w:rPr>
@@ -205,12 +191,13 @@
     <w:p>
       <w:pPr>
         <w:spacing w:before="0" w:after="0"/>
+        <w:ind w:left="720"/>
       </w:pPr>
       <w:r>
         <w:rPr>
           <w:rFonts w:ascii="Times New Roman" w:hAnsi="Times New Roman"/>
-          <w:b w:val="0"/>
-          <w:i w:val="0"/>
+          <w:b/>
+          <w:i/>
           <w:color w:val="000000"/>
           <w:sz w:val="18"/>
         </w:rPr>
@@ -1533,27 +1520,13 @@
     <w:p>
       <w:pPr>
         <w:spacing w:before="0" w:after="0"/>
+        <w:ind w:left="720"/>
       </w:pPr>
       <w:r>
         <w:rPr>
           <w:rFonts w:ascii="Times New Roman" w:hAnsi="Times New Roman"/>
-          <w:b w:val="0"/>
-          <w:i w:val="0"/>
-          <w:color w:val="000000"/>
-          <w:sz w:val="18"/>
-        </w:rPr>
-        <w:t>Chorus 1</w:t>
-      </w:r>
-    </w:p>
-    <w:p>
-      <w:pPr>
-        <w:spacing w:before="0" w:after="0"/>
-      </w:pPr>
-      <w:r>
-        <w:rPr>
-          <w:rFonts w:ascii="Times New Roman" w:hAnsi="Times New Roman"/>
-          <w:b w:val="0"/>
-          <w:i w:val="0"/>
+          <w:b/>
+          <w:i/>
           <w:color w:val="000000"/>
           <w:sz w:val="18"/>
         </w:rPr>
@@ -1578,27 +1551,13 @@
     <w:p>
       <w:pPr>
         <w:spacing w:before="0" w:after="0"/>
+        <w:ind w:left="720"/>
       </w:pPr>
       <w:r>
         <w:rPr>
           <w:rFonts w:ascii="Times New Roman" w:hAnsi="Times New Roman"/>
-          <w:b w:val="0"/>
-          <w:i w:val="0"/>
-          <w:color w:val="000000"/>
-          <w:sz w:val="18"/>
-        </w:rPr>
-        <w:t>Chorus 2</w:t>
-      </w:r>
-    </w:p>
-    <w:p>
-      <w:pPr>
-        <w:spacing w:before="0" w:after="0"/>
-      </w:pPr>
-      <w:r>
-        <w:rPr>
-          <w:rFonts w:ascii="Times New Roman" w:hAnsi="Times New Roman"/>
-          <w:b w:val="0"/>
-          <w:i w:val="0"/>
+          <w:b/>
+          <w:i/>
           <w:color w:val="000000"/>
           <w:sz w:val="18"/>
         </w:rPr>
@@ -3223,22 +3182,6 @@
           <w:color w:val="000000"/>
           <w:sz w:val="18"/>
         </w:rPr>
-        <w:t>D A FIS h</w:t>
-      </w:r>
-    </w:p>
-    <w:p>
-      <w:pPr>
-        <w:spacing w:before="0" w:after="0"/>
-        <w:ind w:left="720"/>
-      </w:pPr>
-      <w:r>
-        <w:rPr>
-          <w:rFonts w:ascii="Times New Roman" w:hAnsi="Times New Roman"/>
-          <w:b/>
-          <w:i/>
-          <w:color w:val="000000"/>
-          <w:sz w:val="18"/>
-        </w:rPr>
         <w:t>Ti dao si nam čvrstu riječ</w:t>
       </w:r>
     </w:p>
@@ -3256,22 +3199,6 @@
           <w:sz w:val="18"/>
         </w:rPr>
         <w:t>Daj nam svima Duha svog</w:t>
-      </w:r>
-    </w:p>
-    <w:p>
-      <w:pPr>
-        <w:spacing w:before="0" w:after="0"/>
-        <w:ind w:left="720"/>
-      </w:pPr>
-      <w:r>
-        <w:rPr>
-          <w:rFonts w:ascii="Times New Roman" w:hAnsi="Times New Roman"/>
-          <w:b/>
-          <w:i/>
-          <w:color w:val="000000"/>
-          <w:sz w:val="18"/>
-        </w:rPr>
-        <w:t>D A FIS h</w:t>
       </w:r>
     </w:p>
     <w:p>
@@ -3503,7 +3430,7 @@
     </w:p>
     <w:sectPr>
       <w:pgSz w:w="16838" w:h="11906"/>
-      <w:pgMar w:top="850" w:right="850" w:bottom="850" w:left="850" w:header="720" w:footer="720" w:gutter="0"/>
+      <w:pgMar w:top="283" w:right="283" w:bottom="283" w:left="283" w:header="720" w:footer="720" w:gutter="0"/>
       <w:cols w:space="720"/>
       <w:docGrid w:linePitch="360"/>
       <w:cols w:num="3" w:space="720" w:equalWidth="1"/>

</xml_diff>